<commit_message>
hf: veri kartına refined/raw serileri; yükleyiciye --kart ve seri etiket/dal desteği; rapor bağlantısı refined'a
- docs/hf/veri-karti.md: Seriler bölümü, dal/etiket kullanımı, seri başına sınırlar, sürüm tablosunda seri
- hf-veri-yukle: --kart (main + seri dallarına yalnız README), yeni sürümde seri eş etiketi ve dal taşıma,
  v0.2.0 varsayılan olarak yüklenmez
- ip1.md + docx: veri bağlantısı tree/refined (main artık v0.2.1)

Co-Authored-By: Claude Opus 5.5 <noreply@anthropic.com>
</commit_message>
<xml_diff>
--- a/rapor-bırag-dolu.docx
+++ b/rapor-bırag-dolu.docx
@@ -2635,7 +2635,22 @@
                 <w:sz w:val="20"/>
                 <w:szCs w:val="20"/>
               </w:rPr>
-              <w:t xml:space="preserve">'de aynı 1.058 kaydın 1.036'sında thinking yeniden yazıldı. İlk sürümün thinking'lerinde biçimsel kalıplar ağır basıyordu: %30,6'sında "sormuyorum" gibi meta-yorumlar, %22,8'inde işaret simgeleri vardı. Yeni sürümde bu oranlar %3,1 ve %0,2'ye indi. İP2'deki 26B ince ayarı bu sürümle yapıldı. Veri kümesi Hugging Face'te paylaşıldı (https://huggingface.co/datasets/yildirim34/birag-dataset).</w:t>
+              <w:t xml:space="preserve">'de aynı 1.058 kaydın 1.036'sında thinking yeniden yazıldı. İlk sürümün thinking'lerinde biçimsel kalıplar ağır basıyordu: %30,6'sında "sormuyorum" gibi meta-yorumlar, %22,8'inde işaret simgeleri vardı. Yeni sürümde bu oranlar %3,1 ve %0,2'ye indi. İP2'deki 26B ince ayarı bu sürümle yapıldı. Veri kümesi Hugging Face'te paylaşıldı; bu sürümler deponun </w:t>
+            </w:r>
+            <w:r>
+              <w:rPr>
+                <w:rFonts w:ascii="Consolas" w:hAnsi="Consolas" w:cs="Consolas"/>
+                <w:sz w:val="18"/>
+                <w:szCs w:val="18"/>
+              </w:rPr>
+              <w:t xml:space="preserve">refined</w:t>
+            </w:r>
+            <w:r>
+              <w:rPr>
+                <w:sz w:val="20"/>
+                <w:szCs w:val="20"/>
+              </w:rPr>
+              <w:t xml:space="preserve"> serisidir (https://huggingface.co/datasets/yildirim34/birag-dataset/tree/refined).</w:t>
             </w:r>
           </w:p>
           <w:p>
@@ -3441,7 +3456,22 @@
                 <w:sz w:val="20"/>
                 <w:szCs w:val="20"/>
               </w:rPr>
-              <w:t xml:space="preserve">) ve manifestler (https://huggingface.co/datasets/yildirim34/birag-dataset)</w:t>
+              <w:t xml:space="preserve">) ve manifestler (</w:t>
+            </w:r>
+            <w:r>
+              <w:rPr>
+                <w:rFonts w:ascii="Consolas" w:hAnsi="Consolas" w:cs="Consolas"/>
+                <w:sz w:val="18"/>
+                <w:szCs w:val="18"/>
+              </w:rPr>
+              <w:t xml:space="preserve">refined</w:t>
+            </w:r>
+            <w:r>
+              <w:rPr>
+                <w:sz w:val="20"/>
+                <w:szCs w:val="20"/>
+              </w:rPr>
+              <w:t xml:space="preserve"> serisi, https://huggingface.co/datasets/yildirim34/birag-dataset/tree/refined)</w:t>
             </w:r>
           </w:p>
           <w:p>

</xml_diff>